<commit_message>
Listo el ejercicio 6
</commit_message>
<xml_diff>
--- a/results/Preguntas Ex 6.docx
+++ b/results/Preguntas Ex 6.docx
@@ -4,16 +4,9 @@
   <w:body>
     <w:p>
       <w:pPr>
-        <w:rPr>
-          <w:b/>
-          <w:bCs/>
-        </w:rPr>
-      </w:pPr>
-      <w:r>
-        <w:rPr>
-          <w:b/>
-          <w:bCs/>
-        </w:rPr>
+        <w:pStyle w:val="Ttulo2"/>
+      </w:pPr>
+      <w:r>
         <w:t>a) Entrada NCBI-Gene y breve descripción</w:t>
       </w:r>
     </w:p>
@@ -67,77 +60,37 @@
         <w:rPr>
           <w:b/>
           <w:bCs/>
-        </w:rPr>
-        <w:t>Qué hace la proteína y por qué la elegí (resumen):</w:t>
+          <w:lang w:val="es-MX"/>
+        </w:rPr>
+        <w:t>¿</w:t>
+      </w:r>
+      <w:r>
+        <w:rPr>
+          <w:b/>
+          <w:bCs/>
+        </w:rPr>
+        <w:t>Qué hace la proteína</w:t>
+      </w:r>
+      <w:r>
+        <w:rPr>
+          <w:b/>
+          <w:bCs/>
+        </w:rPr>
+        <w:t xml:space="preserve">? </w:t>
       </w:r>
       <w:r>
         <w:br/>
-        <w:t xml:space="preserve">Fibrilina-1 es una glicoproteína extracelular grande que forma parte de las </w:t>
-      </w:r>
-      <w:r>
-        <w:rPr>
-          <w:b/>
-          <w:bCs/>
-        </w:rPr>
-        <w:t>microfibrillas</w:t>
-      </w:r>
-      <w:r>
-        <w:t xml:space="preserve"> de la matriz extracelular y también genera la hormona </w:t>
-      </w:r>
-      <w:proofErr w:type="spellStart"/>
-      <w:r>
-        <w:rPr>
-          <w:b/>
-          <w:bCs/>
-        </w:rPr>
+      </w:r>
+      <w:r>
+        <w:t xml:space="preserve">Fibrilina-1 es una glicoproteína extracelular grande que forma parte de las microfibrillas de la matriz extracelular y también genera la hormona </w:t>
+      </w:r>
+      <w:proofErr w:type="spellStart"/>
+      <w:r>
         <w:t>asprosin</w:t>
       </w:r>
       <w:proofErr w:type="spellEnd"/>
       <w:r>
-        <w:t xml:space="preserve">. Las microfibrillas proporcionan soporte estructural y regulan señales en tejidos elásticos y no elásticos; mutaciones en </w:t>
-      </w:r>
-      <w:r>
-        <w:rPr>
-          <w:b/>
-          <w:bCs/>
-        </w:rPr>
-        <w:t>FBN1</w:t>
-      </w:r>
-      <w:r>
-        <w:t xml:space="preserve"> causan el síndrome de Marfan (afectación esquelética, ocular y cardiovascular). </w:t>
-      </w:r>
-      <w:r>
-        <w:t>Elegi</w:t>
-      </w:r>
-      <w:r>
-        <w:t xml:space="preserve">mos el gen </w:t>
-      </w:r>
-      <w:r>
-        <w:t xml:space="preserve">FBN1 porque </w:t>
-      </w:r>
-      <w:r>
-        <w:rPr>
-          <w:b/>
-          <w:bCs/>
-        </w:rPr>
-        <w:t>es el gen asociado a</w:t>
-      </w:r>
-      <w:r>
-        <w:rPr>
-          <w:b/>
-          <w:bCs/>
-        </w:rPr>
-        <w:t xml:space="preserve">l síndrome de </w:t>
-      </w:r>
-      <w:r>
-        <w:rPr>
-          <w:b/>
-          <w:bCs/>
-        </w:rPr>
-        <w:t>Marfan</w:t>
-      </w:r>
-      <w:r>
-        <w:t xml:space="preserve"> y tiene gran interés clínico y biológico.</w:t>
+        <w:t>. Las microfibrillas proporcionan soporte estructural y regulan señales en tejidos elásticos y no elásticos; mutaciones en FBN1 causan el síndrome de Marfan (afectación esquelética, ocular y cardiovascular). Elegimos el gen FBN1 porque es el gen asociado al síndrome de Marfan y tiene gran interés clínico y biológico.</w:t>
       </w:r>
       <w:r>
         <w:br/>
@@ -147,113 +100,87 @@
       </w:r>
       <w:r>
         <w:rPr>
-          <w:b/>
-          <w:bCs/>
-        </w:rPr>
-        <w:t xml:space="preserve">b) ¿Cuántos genes / proteínas homólogas se conocen? </w:t>
-      </w:r>
-      <w:proofErr w:type="spellStart"/>
-      <w:r>
-        <w:rPr>
-          <w:b/>
-          <w:bCs/>
-        </w:rPr>
-        <w:t>HomoloGene</w:t>
-      </w:r>
-      <w:proofErr w:type="spellEnd"/>
-      <w:r>
-        <w:rPr>
-          <w:b/>
-          <w:bCs/>
-        </w:rPr>
-        <w:t xml:space="preserve"> vs </w:t>
-      </w:r>
-      <w:proofErr w:type="spellStart"/>
-      <w:r>
-        <w:rPr>
-          <w:b/>
-          <w:bCs/>
-        </w:rPr>
+          <w:rStyle w:val="Ttulo2Car"/>
+        </w:rPr>
+        <w:t xml:space="preserve">b) ¿Cuántos genes </w:t>
+      </w:r>
+      <w:r>
+        <w:rPr>
+          <w:rStyle w:val="Ttulo2Car"/>
+        </w:rPr>
+        <w:t>o</w:t>
+      </w:r>
+      <w:r>
+        <w:rPr>
+          <w:rStyle w:val="Ttulo2Car"/>
+        </w:rPr>
+        <w:t xml:space="preserve"> proteínas homólogas se conocen?</w:t>
+      </w:r>
+      <w:r>
+        <w:rPr>
+          <w:b/>
+          <w:bCs/>
+        </w:rPr>
+        <w:t xml:space="preserve"> </w:t>
+      </w:r>
+    </w:p>
+    <w:p>
+      <w:proofErr w:type="spellStart"/>
+      <w:r>
         <w:t>Ensembl</w:t>
       </w:r>
       <w:proofErr w:type="spellEnd"/>
-    </w:p>
-    <w:p>
-      <w:proofErr w:type="spellStart"/>
-      <w:r>
-        <w:rPr>
-          <w:b/>
-          <w:bCs/>
-        </w:rPr>
+      <w:r>
+        <w:t xml:space="preserve"> reporta </w:t>
+      </w:r>
+      <w:r>
+        <w:t xml:space="preserve">aproximadamente </w:t>
+      </w:r>
+      <w:r>
+        <w:t>216 ortólogos para el gen humano FBN1</w:t>
+      </w:r>
+      <w:r>
+        <w:rPr>
+          <w:b/>
+          <w:bCs/>
+        </w:rPr>
+        <w:t xml:space="preserve">, </w:t>
+      </w:r>
+      <w:r>
+        <w:t>es decir</w:t>
+      </w:r>
+      <w:r>
+        <w:t>,</w:t>
+      </w:r>
+      <w:r>
+        <w:t xml:space="preserve"> FBN1 tiene </w:t>
+      </w:r>
+      <w:r>
+        <w:t>homólogos</w:t>
+      </w:r>
+      <w:r>
+        <w:t xml:space="preserve"> ampliamente distribuidas en animales (principalmente vertebrados). </w:t>
+      </w:r>
+      <w:proofErr w:type="spellStart"/>
+      <w:r>
         <w:t>Ensembl</w:t>
       </w:r>
       <w:proofErr w:type="spellEnd"/>
       <w:r>
-        <w:rPr>
-          <w:b/>
-          <w:bCs/>
-        </w:rPr>
-        <w:t>:</w:t>
-      </w:r>
-      <w:r>
+        <w:t xml:space="preserve"> además indica </w:t>
+      </w:r>
+      <w:r>
+        <w:t>2</w:t>
+      </w:r>
+      <w:r>
+        <w:rPr>
+          <w:b/>
+          <w:bCs/>
+        </w:rPr>
         <w:t xml:space="preserve"> </w:t>
       </w:r>
       <w:proofErr w:type="spellStart"/>
       <w:r>
-        <w:t>Ensembl</w:t>
-      </w:r>
-      <w:proofErr w:type="spellEnd"/>
-      <w:r>
-        <w:t xml:space="preserve"> reporta </w:t>
-      </w:r>
-      <w:r>
-        <w:t xml:space="preserve">aproximadamente </w:t>
-      </w:r>
-      <w:r>
-        <w:t>216 ortólogos para el gen humano FBN1</w:t>
-      </w:r>
-      <w:r>
-        <w:rPr>
-          <w:b/>
-          <w:bCs/>
-        </w:rPr>
-        <w:t xml:space="preserve">, </w:t>
-      </w:r>
-      <w:r>
-        <w:t>es decir</w:t>
-      </w:r>
-      <w:r>
-        <w:t>,</w:t>
-      </w:r>
-      <w:r>
-        <w:t xml:space="preserve"> FBN1 tiene </w:t>
-      </w:r>
-      <w:r>
-        <w:t>homólogos</w:t>
-      </w:r>
-      <w:r>
-        <w:t xml:space="preserve"> ampliamente distribuidas en animales (principalmente vertebrados). </w:t>
-      </w:r>
-      <w:proofErr w:type="spellStart"/>
-      <w:r>
-        <w:t>Ensembl</w:t>
-      </w:r>
-      <w:proofErr w:type="spellEnd"/>
-      <w:r>
-        <w:t xml:space="preserve"> además indica </w:t>
-      </w:r>
-      <w:r>
-        <w:t>2</w:t>
-      </w:r>
-      <w:r>
-        <w:rPr>
-          <w:b/>
-          <w:bCs/>
-        </w:rPr>
-        <w:t xml:space="preserve"> </w:t>
-      </w:r>
-      <w:proofErr w:type="spellStart"/>
-      <w:r>
         <w:t>par</w:t>
       </w:r>
       <w:r>
@@ -264,35 +191,10 @@
       </w:r>
       <w:proofErr w:type="spellEnd"/>
       <w:r>
-        <w:t xml:space="preserve"> (por </w:t>
-      </w:r>
-      <w:r>
-        <w:t>ejemplo,</w:t>
-      </w:r>
-      <w:r>
-        <w:t xml:space="preserve"> FBN2).</w:t>
-      </w:r>
-    </w:p>
-    <w:p>
-      <w:proofErr w:type="spellStart"/>
-      <w:r>
-        <w:rPr>
-          <w:b/>
-          <w:bCs/>
-        </w:rPr>
-        <w:t>HomoloGene</w:t>
-      </w:r>
-      <w:proofErr w:type="spellEnd"/>
-      <w:r>
-        <w:rPr>
-          <w:b/>
-          <w:bCs/>
-        </w:rPr>
-        <w:t xml:space="preserve"> (NCBI):</w:t>
-      </w:r>
-      <w:r>
-        <w:t xml:space="preserve"> </w:t>
-      </w:r>
+        <w:t xml:space="preserve"> (por ejemplo, FBN2).</w:t>
+      </w:r>
+    </w:p>
+    <w:p>
       <w:proofErr w:type="spellStart"/>
       <w:r>
         <w:t>HomoloGene</w:t>
@@ -390,6 +292,944 @@
         <w:t xml:space="preserve"> también en otros metazoos; no es exclusivo de bacterias u organismos simples (no aparece en bacterias).</w:t>
       </w:r>
     </w:p>
+    <w:p>
+      <w:pPr>
+        <w:pStyle w:val="Ttulo2"/>
+      </w:pPr>
+      <w:r>
+        <w:t xml:space="preserve">c) Transcritos y variantes de </w:t>
+      </w:r>
+      <w:proofErr w:type="spellStart"/>
+      <w:r>
+        <w:t>splicing</w:t>
+      </w:r>
+      <w:proofErr w:type="spellEnd"/>
+      <w:r>
+        <w:t xml:space="preserve"> alternativas</w:t>
+      </w:r>
+    </w:p>
+    <w:p>
+      <w:proofErr w:type="spellStart"/>
+      <w:r>
+        <w:t>Ensembl</w:t>
+      </w:r>
+      <w:proofErr w:type="spellEnd"/>
+      <w:r>
+        <w:t xml:space="preserve"> reporta 14 transcritos</w:t>
+      </w:r>
+      <w:r>
+        <w:rPr>
+          <w:b/>
+          <w:bCs/>
+        </w:rPr>
+        <w:t xml:space="preserve"> </w:t>
+      </w:r>
+      <w:r>
+        <w:t>para el gen humano FBN1. Algunos de esos transcritos codifican isoformas distintas y otros son transcritos no codificantes</w:t>
+      </w:r>
+      <w:r>
+        <w:t>.</w:t>
+      </w:r>
+    </w:p>
+    <w:p>
+      <w:r>
+        <w:t xml:space="preserve">NCBI mantiene </w:t>
+      </w:r>
+      <w:proofErr w:type="spellStart"/>
+      <w:r>
+        <w:rPr>
+          <w:b/>
+          <w:bCs/>
+        </w:rPr>
+        <w:t>RefSeqs</w:t>
+      </w:r>
+      <w:proofErr w:type="spellEnd"/>
+      <w:r>
+        <w:t>; la transcripción</w:t>
+      </w:r>
+      <w:r>
+        <w:rPr>
+          <w:b/>
+          <w:bCs/>
+        </w:rPr>
+        <w:t xml:space="preserve"> </w:t>
+      </w:r>
+      <w:r>
+        <w:t xml:space="preserve">más citada es </w:t>
+      </w:r>
+      <w:r>
+        <w:rPr>
+          <w:b/>
+          <w:bCs/>
+        </w:rPr>
+        <w:t>NM_000138.5</w:t>
+      </w:r>
+      <w:r>
+        <w:t xml:space="preserve"> (transcrito codificante para fibrillina-1). NCBI muestra múltiples </w:t>
+      </w:r>
+      <w:proofErr w:type="spellStart"/>
+      <w:r>
+        <w:t>RefSeqs</w:t>
+      </w:r>
+      <w:proofErr w:type="spellEnd"/>
+      <w:r>
+        <w:t xml:space="preserve">/isoformas, pero el conteo y clasificación puede diferir de </w:t>
+      </w:r>
+      <w:proofErr w:type="spellStart"/>
+      <w:r>
+        <w:t>Ensembl</w:t>
+      </w:r>
+      <w:proofErr w:type="spellEnd"/>
+      <w:r>
+        <w:t xml:space="preserve"> porque NCBI usa su propio pipeline y</w:t>
+      </w:r>
+      <w:r>
+        <w:t xml:space="preserve"> filtrado</w:t>
+      </w:r>
+      <w:r>
+        <w:t>.</w:t>
+      </w:r>
+    </w:p>
+    <w:p>
+      <w:r>
+        <w:lastRenderedPageBreak/>
+        <w:t xml:space="preserve"> </w:t>
+      </w:r>
+    </w:p>
+    <w:p>
+      <w:r>
+        <w:rPr>
+          <w:b/>
+          <w:bCs/>
+        </w:rPr>
+        <w:t>¿Cuántos se expresan y/o tienen funciones alternativas?</w:t>
+      </w:r>
+    </w:p>
+    <w:p>
+      <w:pPr>
+        <w:numPr>
+          <w:ilvl w:val="0"/>
+          <w:numId w:val="2"/>
+        </w:numPr>
+      </w:pPr>
+      <w:r>
+        <w:t>Hay evidencia de isoformas expresadas en tejidos (fibroblastos, tejido conectivo, ojo, aorta). Algunos transcritos producen la proteína completa (fibrillina-1) y otr</w:t>
+      </w:r>
+      <w:r>
+        <w:t>a</w:t>
+      </w:r>
+      <w:r>
+        <w:t xml:space="preserve">s isoformas tienen pequeñas diferencias en ciertas partes de la proteína (los dominios EGF/TB), y eso puede cambiar cómo se conecta con otras moléculas o cómo participa en la estructura del tejido conectivo; además, el procesamiento genera </w:t>
+      </w:r>
+      <w:proofErr w:type="spellStart"/>
+      <w:r>
+        <w:rPr>
+          <w:b/>
+          <w:bCs/>
+        </w:rPr>
+        <w:t>asprosin</w:t>
+      </w:r>
+      <w:proofErr w:type="spellEnd"/>
+      <w:r>
+        <w:t xml:space="preserve">, que actúa como hormona. Por </w:t>
+      </w:r>
+      <w:r>
+        <w:t xml:space="preserve">lo </w:t>
+      </w:r>
+      <w:r>
+        <w:t>tanto</w:t>
+      </w:r>
+      <w:r>
+        <w:t>,</w:t>
+      </w:r>
+      <w:r>
+        <w:t xml:space="preserve"> sí existen funciones alternativas/regulatorias (</w:t>
+      </w:r>
+      <w:r>
+        <w:rPr>
+          <w:b/>
+          <w:bCs/>
+        </w:rPr>
+        <w:t>estructura</w:t>
+      </w:r>
+      <w:r>
+        <w:rPr>
+          <w:b/>
+          <w:bCs/>
+        </w:rPr>
+        <w:t>l</w:t>
+      </w:r>
+      <w:r>
+        <w:rPr>
+          <w:b/>
+          <w:bCs/>
+        </w:rPr>
+        <w:t xml:space="preserve"> vs hormonal</w:t>
+      </w:r>
+      <w:r>
+        <w:t xml:space="preserve">). </w:t>
+      </w:r>
+    </w:p>
+    <w:p>
+      <w:r>
+        <w:rPr>
+          <w:b/>
+          <w:bCs/>
+        </w:rPr>
+        <w:t xml:space="preserve">Diferencias entre </w:t>
+      </w:r>
+      <w:proofErr w:type="spellStart"/>
+      <w:r>
+        <w:rPr>
+          <w:b/>
+          <w:bCs/>
+        </w:rPr>
+        <w:t>Ensembl</w:t>
+      </w:r>
+      <w:proofErr w:type="spellEnd"/>
+      <w:r>
+        <w:rPr>
+          <w:b/>
+          <w:bCs/>
+        </w:rPr>
+        <w:t xml:space="preserve"> y NCBI (por qué difieren y cuál es “más precisa”):</w:t>
+      </w:r>
+    </w:p>
+    <w:p>
+      <w:pPr>
+        <w:numPr>
+          <w:ilvl w:val="0"/>
+          <w:numId w:val="3"/>
+        </w:numPr>
+      </w:pPr>
+      <w:proofErr w:type="spellStart"/>
+      <w:r>
+        <w:t>Ensembl</w:t>
+      </w:r>
+      <w:proofErr w:type="spellEnd"/>
+      <w:r>
+        <w:t xml:space="preserve"> normalmente muestra una mayor cantidad de transcritos</w:t>
+      </w:r>
+      <w:r>
+        <w:t xml:space="preserve"> </w:t>
+      </w:r>
+      <w:r>
+        <w:t>porque usa datos del genoma completo y de experimentos de ARN (RNA-</w:t>
+      </w:r>
+      <w:proofErr w:type="spellStart"/>
+      <w:r>
+        <w:t>seq</w:t>
+      </w:r>
+      <w:proofErr w:type="spellEnd"/>
+      <w:r>
+        <w:t>) para detectarlos. Su ventaja es que presenta de forma ordenada todas las variantes del gen y permite compararlas fácilmente entre distintas especies.</w:t>
+      </w:r>
+    </w:p>
+    <w:p>
+      <w:pPr>
+        <w:numPr>
+          <w:ilvl w:val="0"/>
+          <w:numId w:val="3"/>
+        </w:numPr>
+      </w:pPr>
+      <w:r>
+        <w:t>NCBI/</w:t>
+      </w:r>
+      <w:proofErr w:type="spellStart"/>
+      <w:r>
+        <w:t>RefSeq</w:t>
+      </w:r>
+      <w:proofErr w:type="spellEnd"/>
+      <w:r>
+        <w:t xml:space="preserve"> se enfoca en mostrar solo las secuencias más confiables y revisadas por expertos. </w:t>
+      </w:r>
+      <w:proofErr w:type="spellStart"/>
+      <w:r>
+        <w:t>RefSeq</w:t>
+      </w:r>
+      <w:proofErr w:type="spellEnd"/>
+      <w:r>
+        <w:t xml:space="preserve"> prioriza las</w:t>
+      </w:r>
+      <w:r>
+        <w:t xml:space="preserve"> versiones del gen</w:t>
+      </w:r>
+      <w:r>
+        <w:t xml:space="preserve"> que ya fueron comprobadas en experimentos o publicadas en estudios científicos. Por eso, sus transcripciones son menos numerosas, pero tienen mayor respaldo experimental y calidad garantizada</w:t>
+      </w:r>
+      <w:r>
+        <w:t>.</w:t>
+      </w:r>
+    </w:p>
+    <w:p>
+      <w:r>
+        <w:rPr>
+          <w:b/>
+          <w:bCs/>
+        </w:rPr>
+        <w:t>Conclusión:</w:t>
+      </w:r>
+      <w:r>
+        <w:t xml:space="preserve"> Para anotar transcritos </w:t>
+      </w:r>
+      <w:proofErr w:type="spellStart"/>
+      <w:r>
+        <w:t>Ensembl</w:t>
+      </w:r>
+      <w:proofErr w:type="spellEnd"/>
+      <w:r>
+        <w:t xml:space="preserve"> es más completo en cantidad y en evidencia</w:t>
+      </w:r>
+      <w:r>
+        <w:t xml:space="preserve"> de transcriptos</w:t>
+      </w:r>
+      <w:r>
+        <w:t xml:space="preserve">; para secuencias de referencia </w:t>
+      </w:r>
+      <w:r>
+        <w:t xml:space="preserve">respaldadas </w:t>
+      </w:r>
+      <w:r>
+        <w:t xml:space="preserve">y </w:t>
+      </w:r>
+      <w:r>
+        <w:t xml:space="preserve">de </w:t>
+      </w:r>
+      <w:r>
+        <w:t>uso clínico NCBI/</w:t>
+      </w:r>
+      <w:proofErr w:type="spellStart"/>
+      <w:r>
+        <w:t>RefSeq</w:t>
+      </w:r>
+      <w:proofErr w:type="spellEnd"/>
+      <w:r>
+        <w:t xml:space="preserve"> es frecuentemente preferido.</w:t>
+      </w:r>
+    </w:p>
+    <w:p>
+      <w:pPr>
+        <w:pStyle w:val="Ttulo2"/>
+      </w:pPr>
+      <w:r>
+        <w:t xml:space="preserve">d) Interacciones </w:t>
+      </w:r>
+      <w:r>
+        <w:t>proteicas</w:t>
+      </w:r>
+      <w:r>
+        <w:t xml:space="preserve"> </w:t>
+      </w:r>
+      <w:r>
+        <w:t>¿</w:t>
+      </w:r>
+      <w:r>
+        <w:t>con cuántas interactúa y patrones?</w:t>
+      </w:r>
+    </w:p>
+    <w:p>
+      <w:proofErr w:type="spellStart"/>
+      <w:r>
+        <w:t>UniProt</w:t>
+      </w:r>
+      <w:proofErr w:type="spellEnd"/>
+      <w:r>
+        <w:t xml:space="preserve"> lista interacciones experimentales y por similitud; entre interacciones destacadas figuran: THSD4, FBLN2, FBLN5, LTBP1, LTBP2, integrinas y proteínas implicadas en ensamblaje de microfibrillas.</w:t>
+      </w:r>
+      <w:r>
+        <w:t xml:space="preserve"> </w:t>
+      </w:r>
+    </w:p>
+    <w:p>
+      <w:r>
+        <w:t xml:space="preserve">NCBI Gene incluye enlaces a bases de datos de interacción y referencias; muchas de las interacciones listadas por NCBI coinciden (LTBP1/2, </w:t>
+      </w:r>
+      <w:proofErr w:type="spellStart"/>
+      <w:r>
+        <w:t>fibulinas</w:t>
+      </w:r>
+      <w:proofErr w:type="spellEnd"/>
+      <w:r>
+        <w:t>, proteínas asociadas a microfibrillas).</w:t>
+      </w:r>
+      <w:r>
+        <w:t xml:space="preserve"> </w:t>
+      </w:r>
+    </w:p>
+    <w:p>
+      <w:r>
+        <w:rPr>
+          <w:b/>
+          <w:bCs/>
+        </w:rPr>
+        <w:t>Patrón / relación entre interacciones:</w:t>
+      </w:r>
+    </w:p>
+    <w:p>
+      <w:pPr>
+        <w:numPr>
+          <w:ilvl w:val="0"/>
+          <w:numId w:val="4"/>
+        </w:numPr>
+      </w:pPr>
+      <w:r>
+        <w:t>Mayoritariamente interacciones extracelulares relacionadas con ensamblaje de microfibrillas y asociación con proteínas de la matriz</w:t>
+      </w:r>
+      <w:r>
+        <w:t xml:space="preserve"> </w:t>
+      </w:r>
+      <w:r>
+        <w:t>extra</w:t>
+      </w:r>
+      <w:r>
+        <w:t>cel</w:t>
+      </w:r>
+      <w:r>
+        <w:t>ular</w:t>
+      </w:r>
+      <w:r>
+        <w:t xml:space="preserve"> (</w:t>
+      </w:r>
+      <w:proofErr w:type="spellStart"/>
+      <w:r>
+        <w:t>fibulinas</w:t>
+      </w:r>
+      <w:proofErr w:type="spellEnd"/>
+      <w:r>
+        <w:t xml:space="preserve">, </w:t>
+      </w:r>
+      <w:proofErr w:type="spellStart"/>
+      <w:r>
+        <w:t>LTBPs</w:t>
+      </w:r>
+      <w:proofErr w:type="spellEnd"/>
+      <w:r>
+        <w:t>) y receptores de adhesión (integrinas).</w:t>
+      </w:r>
+    </w:p>
+    <w:p>
+      <w:pPr>
+        <w:numPr>
+          <w:ilvl w:val="0"/>
+          <w:numId w:val="4"/>
+        </w:numPr>
+      </w:pPr>
+      <w:r>
+        <w:lastRenderedPageBreak/>
+        <w:t>Algunas interacciones regulan TGF-β y señalización (</w:t>
+      </w:r>
+      <w:proofErr w:type="spellStart"/>
+      <w:r>
+        <w:t>LTBPs</w:t>
+      </w:r>
+      <w:proofErr w:type="spellEnd"/>
+      <w:r>
+        <w:t>).</w:t>
+      </w:r>
+    </w:p>
+    <w:p>
+      <w:pPr>
+        <w:numPr>
+          <w:ilvl w:val="0"/>
+          <w:numId w:val="4"/>
+        </w:numPr>
+      </w:pPr>
+      <w:r>
+        <w:t>No es habitual encontrar interacciones intracelulares fuertes — la proteína actúa en matriz extracelular.</w:t>
+      </w:r>
+    </w:p>
+    <w:p>
+      <w:r>
+        <w:rPr>
+          <w:b/>
+          <w:bCs/>
+        </w:rPr>
+        <w:t>¿Hay diferencias entre tabla</w:t>
+      </w:r>
+      <w:r>
+        <w:rPr>
+          <w:b/>
+          <w:bCs/>
+        </w:rPr>
+        <w:t>s</w:t>
+      </w:r>
+      <w:r>
+        <w:rPr>
+          <w:b/>
+          <w:bCs/>
+        </w:rPr>
+        <w:t>?</w:t>
+      </w:r>
+    </w:p>
+    <w:p>
+      <w:pPr>
+        <w:numPr>
+          <w:ilvl w:val="0"/>
+          <w:numId w:val="5"/>
+        </w:numPr>
+      </w:pPr>
+      <w:r>
+        <w:t>Coinciden en las interacciones más establecidas (</w:t>
+      </w:r>
+      <w:proofErr w:type="spellStart"/>
+      <w:r>
+        <w:t>fibulinas</w:t>
+      </w:r>
+      <w:proofErr w:type="spellEnd"/>
+      <w:r>
+        <w:t xml:space="preserve">, </w:t>
+      </w:r>
+      <w:proofErr w:type="spellStart"/>
+      <w:r>
+        <w:t>LTBPs</w:t>
+      </w:r>
+      <w:proofErr w:type="spellEnd"/>
+      <w:r>
+        <w:t xml:space="preserve">). </w:t>
+      </w:r>
+      <w:proofErr w:type="spellStart"/>
+      <w:r>
+        <w:t>UniProt</w:t>
+      </w:r>
+      <w:proofErr w:type="spellEnd"/>
+      <w:r>
+        <w:t xml:space="preserve"> suele listar interacciones específicas detectadas por experimentos; NCBI integra múltiples fuentes y enlaces. Es posible que alguna interacción aparezca en </w:t>
+      </w:r>
+      <w:proofErr w:type="spellStart"/>
+      <w:r>
+        <w:t>UniProt</w:t>
+      </w:r>
+      <w:proofErr w:type="spellEnd"/>
+      <w:r>
+        <w:t xml:space="preserve"> y no en la vista resumida de NCBI</w:t>
+      </w:r>
+      <w:r>
+        <w:t>.</w:t>
+      </w:r>
+    </w:p>
+    <w:p>
+      <w:pPr>
+        <w:pStyle w:val="Ttulo2"/>
+      </w:pPr>
+      <w:r>
+        <w:t>e) Localización celular, procesos biológicos y función molecular</w:t>
+      </w:r>
+    </w:p>
+    <w:p>
+      <w:r>
+        <w:t>La</w:t>
+      </w:r>
+      <w:r>
+        <w:rPr>
+          <w:b/>
+          <w:bCs/>
+        </w:rPr>
+        <w:t xml:space="preserve"> </w:t>
+      </w:r>
+      <w:r>
+        <w:t>fibrillina-1 forma parte de la matriz extracelular</w:t>
+      </w:r>
+      <w:r>
+        <w:t>.</w:t>
+      </w:r>
+    </w:p>
+    <w:p>
+      <w:r>
+        <w:t>Participa</w:t>
+      </w:r>
+      <w:r>
+        <w:t xml:space="preserve"> en formación/organización de microfibrillas</w:t>
+      </w:r>
+      <w:r>
+        <w:t xml:space="preserve">, </w:t>
+      </w:r>
+      <w:r>
+        <w:t>influencia en vías de señalización, y desarrollo/estructura del tejido conectivo.</w:t>
+      </w:r>
+    </w:p>
+    <w:p>
+      <w:r>
+        <w:t>Constituye</w:t>
+      </w:r>
+      <w:r>
+        <w:t xml:space="preserve"> la matriz</w:t>
+      </w:r>
+      <w:r>
+        <w:t xml:space="preserve"> extracelular</w:t>
+      </w:r>
+      <w:r>
+        <w:t xml:space="preserve">, </w:t>
+      </w:r>
+      <w:r>
+        <w:t>en la</w:t>
+      </w:r>
+      <w:r>
+        <w:t xml:space="preserve"> unión </w:t>
+      </w:r>
+      <w:r>
+        <w:t>del</w:t>
+      </w:r>
+      <w:r>
+        <w:t xml:space="preserve"> calcio, y capacidad de interacción con otras proteínas de matriz</w:t>
+      </w:r>
+      <w:r>
+        <w:t xml:space="preserve"> extracelular</w:t>
+      </w:r>
+      <w:r>
+        <w:t xml:space="preserve">. También el precursor produce </w:t>
+      </w:r>
+      <w:proofErr w:type="spellStart"/>
+      <w:r>
+        <w:rPr>
+          <w:b/>
+          <w:bCs/>
+        </w:rPr>
+        <w:t>asprosin</w:t>
+      </w:r>
+      <w:proofErr w:type="spellEnd"/>
+      <w:r>
+        <w:t xml:space="preserve"> con función hormonal.</w:t>
+      </w:r>
+    </w:p>
+    <w:p>
+      <w:pPr>
+        <w:pStyle w:val="Ttulo2"/>
+      </w:pPr>
+      <w:r>
+        <w:t>f) Vías / estructuras metabólicas donde participa</w:t>
+      </w:r>
+    </w:p>
+    <w:p>
+      <w:pPr>
+        <w:numPr>
+          <w:ilvl w:val="0"/>
+          <w:numId w:val="6"/>
+        </w:numPr>
+      </w:pPr>
+      <w:proofErr w:type="spellStart"/>
+      <w:r>
+        <w:t>Reactome</w:t>
+      </w:r>
+      <w:proofErr w:type="spellEnd"/>
+      <w:r>
+        <w:rPr>
+          <w:b/>
+          <w:bCs/>
+        </w:rPr>
+        <w:t xml:space="preserve"> </w:t>
+      </w:r>
+      <w:r>
+        <w:t>incluye a FBN1 en rutas de ensamblaje de fibras elásticas y procesos extracelulares relacionados.</w:t>
+      </w:r>
+    </w:p>
+    <w:p>
+      <w:pPr>
+        <w:numPr>
+          <w:ilvl w:val="0"/>
+          <w:numId w:val="6"/>
+        </w:numPr>
+      </w:pPr>
+      <w:r>
+        <w:t xml:space="preserve">KEGG lo vincula a procesos de señalización y estructuras de </w:t>
+      </w:r>
+      <w:proofErr w:type="spellStart"/>
+      <w:r>
+        <w:t>citosqueleto</w:t>
+      </w:r>
+      <w:proofErr w:type="spellEnd"/>
+      <w:r>
+        <w:t xml:space="preserve"> en múscul</w:t>
+      </w:r>
+      <w:r>
+        <w:t>o</w:t>
+      </w:r>
+      <w:r>
+        <w:t>.</w:t>
+      </w:r>
+    </w:p>
+    <w:p>
+      <w:pPr>
+        <w:pStyle w:val="Ttulo2"/>
+      </w:pPr>
+      <w:r>
+        <w:t xml:space="preserve">g) </w:t>
+      </w:r>
+      <w:r>
+        <w:t>I</w:t>
+      </w:r>
+      <w:r>
+        <w:t>nterpretación de variantes asociadas a la patología</w:t>
+      </w:r>
+    </w:p>
+    <w:p>
+      <w:r>
+        <w:t xml:space="preserve">En </w:t>
+      </w:r>
+      <w:proofErr w:type="spellStart"/>
+      <w:r>
+        <w:t>ClinVar</w:t>
+      </w:r>
+      <w:proofErr w:type="spellEnd"/>
+      <w:r>
+        <w:t xml:space="preserve"> hay numerosas variantes en FBN1 asociadas a Marfan; por </w:t>
+      </w:r>
+      <w:proofErr w:type="gramStart"/>
+      <w:r>
+        <w:t>ejemplo</w:t>
+      </w:r>
+      <w:proofErr w:type="gramEnd"/>
+      <w:r>
+        <w:t xml:space="preserve"> la variante que afecta el sitio de </w:t>
+      </w:r>
+      <w:proofErr w:type="spellStart"/>
+      <w:r>
+        <w:t>splicing</w:t>
+      </w:r>
+      <w:proofErr w:type="spellEnd"/>
+      <w:r>
+        <w:t xml:space="preserve"> </w:t>
+      </w:r>
+      <w:r>
+        <w:rPr>
+          <w:b/>
+          <w:bCs/>
+        </w:rPr>
+        <w:t>NM_000138.5(FBN1</w:t>
+      </w:r>
+      <w:proofErr w:type="gramStart"/>
+      <w:r>
+        <w:rPr>
+          <w:b/>
+          <w:bCs/>
+        </w:rPr>
+        <w:t>):c.</w:t>
+      </w:r>
+      <w:proofErr w:type="gramEnd"/>
+      <w:r>
+        <w:rPr>
+          <w:b/>
+          <w:bCs/>
+        </w:rPr>
+        <w:t>4943-1G&gt;A</w:t>
+      </w:r>
+      <w:r>
+        <w:t xml:space="preserve"> está reportada en </w:t>
+      </w:r>
+      <w:proofErr w:type="spellStart"/>
+      <w:r>
+        <w:t>ClinVar</w:t>
+      </w:r>
+      <w:proofErr w:type="spellEnd"/>
+      <w:r>
+        <w:t xml:space="preserve"> como </w:t>
+      </w:r>
+      <w:proofErr w:type="spellStart"/>
+      <w:r>
+        <w:t>Likely</w:t>
+      </w:r>
+      <w:proofErr w:type="spellEnd"/>
+      <w:r>
+        <w:t xml:space="preserve"> </w:t>
+      </w:r>
+      <w:proofErr w:type="spellStart"/>
+      <w:r>
+        <w:t>pathogenic</w:t>
+      </w:r>
+      <w:proofErr w:type="spellEnd"/>
+      <w:r>
+        <w:t xml:space="preserve">. Otra variante </w:t>
+      </w:r>
+      <w:proofErr w:type="spellStart"/>
+      <w:r>
+        <w:t>splicing</w:t>
+      </w:r>
+      <w:proofErr w:type="spellEnd"/>
+      <w:r>
+        <w:t xml:space="preserve"> </w:t>
+      </w:r>
+      <w:r>
+        <w:rPr>
+          <w:b/>
+          <w:bCs/>
+        </w:rPr>
+        <w:t>c.1468+5G&gt;A</w:t>
+      </w:r>
+      <w:r>
+        <w:t xml:space="preserve"> tiene múltiples reportes en personas con fenotipo Marfan.</w:t>
+      </w:r>
+    </w:p>
+    <w:p>
+      <w:r>
+        <w:rPr>
+          <w:b/>
+          <w:bCs/>
+        </w:rPr>
+        <w:t>F</w:t>
+      </w:r>
+      <w:r>
+        <w:rPr>
+          <w:b/>
+          <w:bCs/>
+        </w:rPr>
+        <w:t>recuencias poblacionales:</w:t>
+      </w:r>
+    </w:p>
+    <w:p>
+      <w:pPr>
+        <w:numPr>
+          <w:ilvl w:val="0"/>
+          <w:numId w:val="7"/>
+        </w:numPr>
+      </w:pPr>
+      <w:r>
+        <w:t xml:space="preserve">Muchas de las variantes patogénicas en FBN1 son raras o ausentes en bases de población. Estudios han mostrado que ninguna variante patogénica conocida excede 0.005% en </w:t>
+      </w:r>
+      <w:proofErr w:type="spellStart"/>
+      <w:r>
+        <w:t>gnomAD</w:t>
+      </w:r>
+      <w:proofErr w:type="spellEnd"/>
+      <w:r>
+        <w:t>.</w:t>
+      </w:r>
+      <w:r>
+        <w:t xml:space="preserve"> </w:t>
+      </w:r>
+    </w:p>
+    <w:p>
+      <w:r>
+        <w:rPr>
+          <w:b/>
+          <w:bCs/>
+        </w:rPr>
+        <w:lastRenderedPageBreak/>
+        <w:t>¿Qué grupo étnico parece más afectado?</w:t>
+      </w:r>
+      <w:r>
+        <w:br/>
+        <w:t xml:space="preserve">No hay una clara concentración étnica general para todas las variantes: la frecuencia y tipos de variantes pueden variar por población y </w:t>
+      </w:r>
+      <w:r>
+        <w:t>algunos análisis</w:t>
+      </w:r>
+      <w:r>
+        <w:t xml:space="preserve"> mostraron mayor número de variantes predecibles patogénicas en </w:t>
+      </w:r>
+      <w:r>
+        <w:t>el este asiático</w:t>
+      </w:r>
+      <w:r>
+        <w:t xml:space="preserve"> en </w:t>
+      </w:r>
+      <w:proofErr w:type="spellStart"/>
+      <w:r>
+        <w:t>gnomAD</w:t>
+      </w:r>
+      <w:proofErr w:type="spellEnd"/>
+      <w:r>
+        <w:t>, pero la enfermedad no tiene una gran predisposición étnica conocida.</w:t>
+      </w:r>
+    </w:p>
+    <w:p/>
+    <w:p>
+      <w:pPr>
+        <w:pStyle w:val="Ttulo2"/>
+      </w:pPr>
+      <w:r>
+        <w:t>h) Significancia clínica</w:t>
+      </w:r>
+    </w:p>
+    <w:p>
+      <w:pPr>
+        <w:numPr>
+          <w:ilvl w:val="0"/>
+          <w:numId w:val="8"/>
+        </w:numPr>
+      </w:pPr>
+      <w:proofErr w:type="spellStart"/>
+      <w:r>
+        <w:t>ClinVar</w:t>
+      </w:r>
+      <w:proofErr w:type="spellEnd"/>
+      <w:r>
+        <w:t xml:space="preserve"> contiene miles de envíos para variantes de FBN1; muchas entradas están clasificadas como </w:t>
+      </w:r>
+      <w:proofErr w:type="spellStart"/>
+      <w:r>
+        <w:rPr>
+          <w:i/>
+          <w:iCs/>
+        </w:rPr>
+        <w:t>Pathogenic</w:t>
+      </w:r>
+      <w:proofErr w:type="spellEnd"/>
+      <w:r>
+        <w:t xml:space="preserve"> o </w:t>
+      </w:r>
+      <w:proofErr w:type="spellStart"/>
+      <w:r>
+        <w:rPr>
+          <w:i/>
+          <w:iCs/>
+        </w:rPr>
+        <w:t>Likely</w:t>
+      </w:r>
+      <w:proofErr w:type="spellEnd"/>
+      <w:r>
+        <w:rPr>
+          <w:i/>
+          <w:iCs/>
+        </w:rPr>
+        <w:t xml:space="preserve"> </w:t>
+      </w:r>
+      <w:proofErr w:type="spellStart"/>
+      <w:r>
+        <w:rPr>
+          <w:i/>
+          <w:iCs/>
+        </w:rPr>
+        <w:t>pathogenic</w:t>
+      </w:r>
+      <w:proofErr w:type="spellEnd"/>
+      <w:r>
+        <w:t xml:space="preserve"> para Marfan</w:t>
+      </w:r>
+      <w:r>
+        <w:t>.</w:t>
+      </w:r>
+    </w:p>
+    <w:p>
+      <w:pPr>
+        <w:numPr>
+          <w:ilvl w:val="0"/>
+          <w:numId w:val="8"/>
+        </w:numPr>
+      </w:pPr>
+      <w:r>
+        <w:t xml:space="preserve">El </w:t>
+      </w:r>
+      <w:r>
+        <w:t xml:space="preserve">consenso </w:t>
+      </w:r>
+      <w:r>
+        <w:t xml:space="preserve">clínico </w:t>
+      </w:r>
+      <w:r>
+        <w:t xml:space="preserve">de </w:t>
+      </w:r>
+      <w:proofErr w:type="spellStart"/>
+      <w:r>
+        <w:t>GeneReviews</w:t>
+      </w:r>
+      <w:proofErr w:type="spellEnd"/>
+      <w:r>
+        <w:t xml:space="preserve"> indica que la identificación de una variante patogénica en FBN1 confirma diagnóstico molecular de Marfan en el contexto clínico.</w:t>
+      </w:r>
+      <w:r>
+        <w:t xml:space="preserve"> </w:t>
+      </w:r>
+    </w:p>
+    <w:p/>
     <w:p/>
     <w:p/>
     <w:sectPr>
@@ -405,6 +1245,453 @@
 <file path=word/numbering.xml><?xml version="1.0" encoding="utf-8"?>
 <w:numbering xmlns:wpc="http://schemas.microsoft.com/office/word/2010/wordprocessingCanvas" xmlns:cx="http://schemas.microsoft.com/office/drawing/2014/chartex" xmlns:cx1="http://schemas.microsoft.com/office/drawing/2015/9/8/chartex" xmlns:cx2="http://schemas.microsoft.com/office/drawing/2015/10/21/chartex" xmlns:cx3="http://schemas.microsoft.com/office/drawing/2016/5/9/chartex" xmlns:cx4="http://schemas.microsoft.com/office/drawing/2016/5/10/chartex" xmlns:cx5="http://schemas.microsoft.com/office/drawing/2016/5/11/chartex" xmlns:cx6="http://schemas.microsoft.com/office/drawing/2016/5/12/chartex" xmlns:cx7="http://schemas.microsoft.com/office/drawing/2016/5/13/chartex" xmlns:cx8="http://schemas.microsoft.com/office/drawing/2016/5/14/chartex" xmlns:mc="http://schemas.openxmlformats.org/markup-compatibility/2006" xmlns:aink="http://schemas.microsoft.com/office/drawing/2016/ink" xmlns:am3d="http://schemas.microsoft.com/office/drawing/2017/model3d" xmlns:o="urn:schemas-microsoft-com:office:office" xmlns:oel="http://schemas.microsoft.com/office/2019/extlst" xmlns:r="http://schemas.openxmlformats.org/officeDocument/2006/relationships" xmlns:m="http://schemas.openxmlformats.org/officeDocument/2006/math" xmlns:v="urn:schemas-microsoft-com:vml" xmlns:wp14="http://schemas.microsoft.com/office/word/2010/wordprocessingDrawing" xmlns:wp="http://schemas.openxmlformats.org/drawingml/2006/wordprocessingDrawing" xmlns:w10="urn:schemas-microsoft-com:office:word" xmlns:w="http://schemas.openxmlformats.org/wordprocessingml/2006/main" xmlns:w14="http://schemas.microsoft.com/office/word/2010/wordml" xmlns:w15="http://schemas.microsoft.com/office/word/2012/wordml" xmlns:w16cex="http://schemas.microsoft.com/office/word/2018/wordml/cex" xmlns:w16cid="http://schemas.microsoft.com/office/word/2016/wordml/cid" xmlns:w16="http://schemas.microsoft.com/office/word/2018/wordml" xmlns:w16du="http://schemas.microsoft.com/office/word/2023/wordml/word16du" xmlns:w16sdtdh="http://schemas.microsoft.com/office/word/2020/wordml/sdtdatahash" xmlns:w16sdtfl="http://schemas.microsoft.com/office/word/2024/wordml/sdtformatlock" xmlns:w16se="http://schemas.microsoft.com/office/word/2015/wordml/symex" xmlns:wpg="http://schemas.microsoft.com/office/word/2010/wordprocessingGroup" xmlns:wpi="http://schemas.microsoft.com/office/word/2010/wordprocessingInk" xmlns:wne="http://schemas.microsoft.com/office/word/2006/wordml" xmlns:wps="http://schemas.microsoft.com/office/word/2010/wordprocessingShape" mc:Ignorable="w14 w15 w16se w16cid w16 w16cex w16sdtdh w16sdtfl w16du wp14">
   <w:abstractNum w:abstractNumId="0" w15:restartNumberingAfterBreak="0">
+    <w:nsid w:val="0BEF7960"/>
+    <w:multiLevelType w:val="multilevel"/>
+    <w:tmpl w:val="7582613E"/>
+    <w:lvl w:ilvl="0">
+      <w:start w:val="1"/>
+      <w:numFmt w:val="bullet"/>
+      <w:lvlText w:val=""/>
+      <w:lvlJc w:val="left"/>
+      <w:pPr>
+        <w:tabs>
+          <w:tab w:val="num" w:pos="720"/>
+        </w:tabs>
+        <w:ind w:left="720" w:hanging="360"/>
+      </w:pPr>
+      <w:rPr>
+        <w:rFonts w:ascii="Symbol" w:hAnsi="Symbol" w:hint="default"/>
+        <w:sz w:val="20"/>
+      </w:rPr>
+    </w:lvl>
+    <w:lvl w:ilvl="1" w:tentative="1">
+      <w:start w:val="1"/>
+      <w:numFmt w:val="bullet"/>
+      <w:lvlText w:val="o"/>
+      <w:lvlJc w:val="left"/>
+      <w:pPr>
+        <w:tabs>
+          <w:tab w:val="num" w:pos="1440"/>
+        </w:tabs>
+        <w:ind w:left="1440" w:hanging="360"/>
+      </w:pPr>
+      <w:rPr>
+        <w:rFonts w:ascii="Courier New" w:hAnsi="Courier New" w:hint="default"/>
+        <w:sz w:val="20"/>
+      </w:rPr>
+    </w:lvl>
+    <w:lvl w:ilvl="2" w:tentative="1">
+      <w:start w:val="1"/>
+      <w:numFmt w:val="bullet"/>
+      <w:lvlText w:val=""/>
+      <w:lvlJc w:val="left"/>
+      <w:pPr>
+        <w:tabs>
+          <w:tab w:val="num" w:pos="2160"/>
+        </w:tabs>
+        <w:ind w:left="2160" w:hanging="360"/>
+      </w:pPr>
+      <w:rPr>
+        <w:rFonts w:ascii="Wingdings" w:hAnsi="Wingdings" w:hint="default"/>
+        <w:sz w:val="20"/>
+      </w:rPr>
+    </w:lvl>
+    <w:lvl w:ilvl="3" w:tentative="1">
+      <w:start w:val="1"/>
+      <w:numFmt w:val="bullet"/>
+      <w:lvlText w:val=""/>
+      <w:lvlJc w:val="left"/>
+      <w:pPr>
+        <w:tabs>
+          <w:tab w:val="num" w:pos="2880"/>
+        </w:tabs>
+        <w:ind w:left="2880" w:hanging="360"/>
+      </w:pPr>
+      <w:rPr>
+        <w:rFonts w:ascii="Wingdings" w:hAnsi="Wingdings" w:hint="default"/>
+        <w:sz w:val="20"/>
+      </w:rPr>
+    </w:lvl>
+    <w:lvl w:ilvl="4" w:tentative="1">
+      <w:start w:val="1"/>
+      <w:numFmt w:val="bullet"/>
+      <w:lvlText w:val=""/>
+      <w:lvlJc w:val="left"/>
+      <w:pPr>
+        <w:tabs>
+          <w:tab w:val="num" w:pos="3600"/>
+        </w:tabs>
+        <w:ind w:left="3600" w:hanging="360"/>
+      </w:pPr>
+      <w:rPr>
+        <w:rFonts w:ascii="Wingdings" w:hAnsi="Wingdings" w:hint="default"/>
+        <w:sz w:val="20"/>
+      </w:rPr>
+    </w:lvl>
+    <w:lvl w:ilvl="5" w:tentative="1">
+      <w:start w:val="1"/>
+      <w:numFmt w:val="bullet"/>
+      <w:lvlText w:val=""/>
+      <w:lvlJc w:val="left"/>
+      <w:pPr>
+        <w:tabs>
+          <w:tab w:val="num" w:pos="4320"/>
+        </w:tabs>
+        <w:ind w:left="4320" w:hanging="360"/>
+      </w:pPr>
+      <w:rPr>
+        <w:rFonts w:ascii="Wingdings" w:hAnsi="Wingdings" w:hint="default"/>
+        <w:sz w:val="20"/>
+      </w:rPr>
+    </w:lvl>
+    <w:lvl w:ilvl="6" w:tentative="1">
+      <w:start w:val="1"/>
+      <w:numFmt w:val="bullet"/>
+      <w:lvlText w:val=""/>
+      <w:lvlJc w:val="left"/>
+      <w:pPr>
+        <w:tabs>
+          <w:tab w:val="num" w:pos="5040"/>
+        </w:tabs>
+        <w:ind w:left="5040" w:hanging="360"/>
+      </w:pPr>
+      <w:rPr>
+        <w:rFonts w:ascii="Wingdings" w:hAnsi="Wingdings" w:hint="default"/>
+        <w:sz w:val="20"/>
+      </w:rPr>
+    </w:lvl>
+    <w:lvl w:ilvl="7" w:tentative="1">
+      <w:start w:val="1"/>
+      <w:numFmt w:val="bullet"/>
+      <w:lvlText w:val=""/>
+      <w:lvlJc w:val="left"/>
+      <w:pPr>
+        <w:tabs>
+          <w:tab w:val="num" w:pos="5760"/>
+        </w:tabs>
+        <w:ind w:left="5760" w:hanging="360"/>
+      </w:pPr>
+      <w:rPr>
+        <w:rFonts w:ascii="Wingdings" w:hAnsi="Wingdings" w:hint="default"/>
+        <w:sz w:val="20"/>
+      </w:rPr>
+    </w:lvl>
+    <w:lvl w:ilvl="8" w:tentative="1">
+      <w:start w:val="1"/>
+      <w:numFmt w:val="bullet"/>
+      <w:lvlText w:val=""/>
+      <w:lvlJc w:val="left"/>
+      <w:pPr>
+        <w:tabs>
+          <w:tab w:val="num" w:pos="6480"/>
+        </w:tabs>
+        <w:ind w:left="6480" w:hanging="360"/>
+      </w:pPr>
+      <w:rPr>
+        <w:rFonts w:ascii="Wingdings" w:hAnsi="Wingdings" w:hint="default"/>
+        <w:sz w:val="20"/>
+      </w:rPr>
+    </w:lvl>
+  </w:abstractNum>
+  <w:abstractNum w:abstractNumId="1" w15:restartNumberingAfterBreak="0">
+    <w:nsid w:val="1C3C58D2"/>
+    <w:multiLevelType w:val="multilevel"/>
+    <w:tmpl w:val="85AEDBA6"/>
+    <w:lvl w:ilvl="0">
+      <w:start w:val="1"/>
+      <w:numFmt w:val="bullet"/>
+      <w:lvlText w:val=""/>
+      <w:lvlJc w:val="left"/>
+      <w:pPr>
+        <w:tabs>
+          <w:tab w:val="num" w:pos="720"/>
+        </w:tabs>
+        <w:ind w:left="720" w:hanging="360"/>
+      </w:pPr>
+      <w:rPr>
+        <w:rFonts w:ascii="Symbol" w:hAnsi="Symbol" w:hint="default"/>
+        <w:sz w:val="20"/>
+      </w:rPr>
+    </w:lvl>
+    <w:lvl w:ilvl="1" w:tentative="1">
+      <w:start w:val="1"/>
+      <w:numFmt w:val="bullet"/>
+      <w:lvlText w:val="o"/>
+      <w:lvlJc w:val="left"/>
+      <w:pPr>
+        <w:tabs>
+          <w:tab w:val="num" w:pos="1440"/>
+        </w:tabs>
+        <w:ind w:left="1440" w:hanging="360"/>
+      </w:pPr>
+      <w:rPr>
+        <w:rFonts w:ascii="Courier New" w:hAnsi="Courier New" w:hint="default"/>
+        <w:sz w:val="20"/>
+      </w:rPr>
+    </w:lvl>
+    <w:lvl w:ilvl="2" w:tentative="1">
+      <w:start w:val="1"/>
+      <w:numFmt w:val="bullet"/>
+      <w:lvlText w:val=""/>
+      <w:lvlJc w:val="left"/>
+      <w:pPr>
+        <w:tabs>
+          <w:tab w:val="num" w:pos="2160"/>
+        </w:tabs>
+        <w:ind w:left="2160" w:hanging="360"/>
+      </w:pPr>
+      <w:rPr>
+        <w:rFonts w:ascii="Wingdings" w:hAnsi="Wingdings" w:hint="default"/>
+        <w:sz w:val="20"/>
+      </w:rPr>
+    </w:lvl>
+    <w:lvl w:ilvl="3" w:tentative="1">
+      <w:start w:val="1"/>
+      <w:numFmt w:val="bullet"/>
+      <w:lvlText w:val=""/>
+      <w:lvlJc w:val="left"/>
+      <w:pPr>
+        <w:tabs>
+          <w:tab w:val="num" w:pos="2880"/>
+        </w:tabs>
+        <w:ind w:left="2880" w:hanging="360"/>
+      </w:pPr>
+      <w:rPr>
+        <w:rFonts w:ascii="Wingdings" w:hAnsi="Wingdings" w:hint="default"/>
+        <w:sz w:val="20"/>
+      </w:rPr>
+    </w:lvl>
+    <w:lvl w:ilvl="4" w:tentative="1">
+      <w:start w:val="1"/>
+      <w:numFmt w:val="bullet"/>
+      <w:lvlText w:val=""/>
+      <w:lvlJc w:val="left"/>
+      <w:pPr>
+        <w:tabs>
+          <w:tab w:val="num" w:pos="3600"/>
+        </w:tabs>
+        <w:ind w:left="3600" w:hanging="360"/>
+      </w:pPr>
+      <w:rPr>
+        <w:rFonts w:ascii="Wingdings" w:hAnsi="Wingdings" w:hint="default"/>
+        <w:sz w:val="20"/>
+      </w:rPr>
+    </w:lvl>
+    <w:lvl w:ilvl="5" w:tentative="1">
+      <w:start w:val="1"/>
+      <w:numFmt w:val="bullet"/>
+      <w:lvlText w:val=""/>
+      <w:lvlJc w:val="left"/>
+      <w:pPr>
+        <w:tabs>
+          <w:tab w:val="num" w:pos="4320"/>
+        </w:tabs>
+        <w:ind w:left="4320" w:hanging="360"/>
+      </w:pPr>
+      <w:rPr>
+        <w:rFonts w:ascii="Wingdings" w:hAnsi="Wingdings" w:hint="default"/>
+        <w:sz w:val="20"/>
+      </w:rPr>
+    </w:lvl>
+    <w:lvl w:ilvl="6" w:tentative="1">
+      <w:start w:val="1"/>
+      <w:numFmt w:val="bullet"/>
+      <w:lvlText w:val=""/>
+      <w:lvlJc w:val="left"/>
+      <w:pPr>
+        <w:tabs>
+          <w:tab w:val="num" w:pos="5040"/>
+        </w:tabs>
+        <w:ind w:left="5040" w:hanging="360"/>
+      </w:pPr>
+      <w:rPr>
+        <w:rFonts w:ascii="Wingdings" w:hAnsi="Wingdings" w:hint="default"/>
+        <w:sz w:val="20"/>
+      </w:rPr>
+    </w:lvl>
+    <w:lvl w:ilvl="7" w:tentative="1">
+      <w:start w:val="1"/>
+      <w:numFmt w:val="bullet"/>
+      <w:lvlText w:val=""/>
+      <w:lvlJc w:val="left"/>
+      <w:pPr>
+        <w:tabs>
+          <w:tab w:val="num" w:pos="5760"/>
+        </w:tabs>
+        <w:ind w:left="5760" w:hanging="360"/>
+      </w:pPr>
+      <w:rPr>
+        <w:rFonts w:ascii="Wingdings" w:hAnsi="Wingdings" w:hint="default"/>
+        <w:sz w:val="20"/>
+      </w:rPr>
+    </w:lvl>
+    <w:lvl w:ilvl="8" w:tentative="1">
+      <w:start w:val="1"/>
+      <w:numFmt w:val="bullet"/>
+      <w:lvlText w:val=""/>
+      <w:lvlJc w:val="left"/>
+      <w:pPr>
+        <w:tabs>
+          <w:tab w:val="num" w:pos="6480"/>
+        </w:tabs>
+        <w:ind w:left="6480" w:hanging="360"/>
+      </w:pPr>
+      <w:rPr>
+        <w:rFonts w:ascii="Wingdings" w:hAnsi="Wingdings" w:hint="default"/>
+        <w:sz w:val="20"/>
+      </w:rPr>
+    </w:lvl>
+  </w:abstractNum>
+  <w:abstractNum w:abstractNumId="2" w15:restartNumberingAfterBreak="0">
+    <w:nsid w:val="21706FD6"/>
+    <w:multiLevelType w:val="multilevel"/>
+    <w:tmpl w:val="8D009BF6"/>
+    <w:lvl w:ilvl="0">
+      <w:start w:val="1"/>
+      <w:numFmt w:val="bullet"/>
+      <w:lvlText w:val=""/>
+      <w:lvlJc w:val="left"/>
+      <w:pPr>
+        <w:tabs>
+          <w:tab w:val="num" w:pos="720"/>
+        </w:tabs>
+        <w:ind w:left="720" w:hanging="360"/>
+      </w:pPr>
+      <w:rPr>
+        <w:rFonts w:ascii="Symbol" w:hAnsi="Symbol" w:hint="default"/>
+        <w:sz w:val="20"/>
+      </w:rPr>
+    </w:lvl>
+    <w:lvl w:ilvl="1" w:tentative="1">
+      <w:start w:val="1"/>
+      <w:numFmt w:val="bullet"/>
+      <w:lvlText w:val="o"/>
+      <w:lvlJc w:val="left"/>
+      <w:pPr>
+        <w:tabs>
+          <w:tab w:val="num" w:pos="1440"/>
+        </w:tabs>
+        <w:ind w:left="1440" w:hanging="360"/>
+      </w:pPr>
+      <w:rPr>
+        <w:rFonts w:ascii="Courier New" w:hAnsi="Courier New" w:hint="default"/>
+        <w:sz w:val="20"/>
+      </w:rPr>
+    </w:lvl>
+    <w:lvl w:ilvl="2" w:tentative="1">
+      <w:start w:val="1"/>
+      <w:numFmt w:val="bullet"/>
+      <w:lvlText w:val=""/>
+      <w:lvlJc w:val="left"/>
+      <w:pPr>
+        <w:tabs>
+          <w:tab w:val="num" w:pos="2160"/>
+        </w:tabs>
+        <w:ind w:left="2160" w:hanging="360"/>
+      </w:pPr>
+      <w:rPr>
+        <w:rFonts w:ascii="Wingdings" w:hAnsi="Wingdings" w:hint="default"/>
+        <w:sz w:val="20"/>
+      </w:rPr>
+    </w:lvl>
+    <w:lvl w:ilvl="3" w:tentative="1">
+      <w:start w:val="1"/>
+      <w:numFmt w:val="bullet"/>
+      <w:lvlText w:val=""/>
+      <w:lvlJc w:val="left"/>
+      <w:pPr>
+        <w:tabs>
+          <w:tab w:val="num" w:pos="2880"/>
+        </w:tabs>
+        <w:ind w:left="2880" w:hanging="360"/>
+      </w:pPr>
+      <w:rPr>
+        <w:rFonts w:ascii="Wingdings" w:hAnsi="Wingdings" w:hint="default"/>
+        <w:sz w:val="20"/>
+      </w:rPr>
+    </w:lvl>
+    <w:lvl w:ilvl="4" w:tentative="1">
+      <w:start w:val="1"/>
+      <w:numFmt w:val="bullet"/>
+      <w:lvlText w:val=""/>
+      <w:lvlJc w:val="left"/>
+      <w:pPr>
+        <w:tabs>
+          <w:tab w:val="num" w:pos="3600"/>
+        </w:tabs>
+        <w:ind w:left="3600" w:hanging="360"/>
+      </w:pPr>
+      <w:rPr>
+        <w:rFonts w:ascii="Wingdings" w:hAnsi="Wingdings" w:hint="default"/>
+        <w:sz w:val="20"/>
+      </w:rPr>
+    </w:lvl>
+    <w:lvl w:ilvl="5" w:tentative="1">
+      <w:start w:val="1"/>
+      <w:numFmt w:val="bullet"/>
+      <w:lvlText w:val=""/>
+      <w:lvlJc w:val="left"/>
+      <w:pPr>
+        <w:tabs>
+          <w:tab w:val="num" w:pos="4320"/>
+        </w:tabs>
+        <w:ind w:left="4320" w:hanging="360"/>
+      </w:pPr>
+      <w:rPr>
+        <w:rFonts w:ascii="Wingdings" w:hAnsi="Wingdings" w:hint="default"/>
+        <w:sz w:val="20"/>
+      </w:rPr>
+    </w:lvl>
+    <w:lvl w:ilvl="6" w:tentative="1">
+      <w:start w:val="1"/>
+      <w:numFmt w:val="bullet"/>
+      <w:lvlText w:val=""/>
+      <w:lvlJc w:val="left"/>
+      <w:pPr>
+        <w:tabs>
+          <w:tab w:val="num" w:pos="5040"/>
+        </w:tabs>
+        <w:ind w:left="5040" w:hanging="360"/>
+      </w:pPr>
+      <w:rPr>
+        <w:rFonts w:ascii="Wingdings" w:hAnsi="Wingdings" w:hint="default"/>
+        <w:sz w:val="20"/>
+      </w:rPr>
+    </w:lvl>
+    <w:lvl w:ilvl="7" w:tentative="1">
+      <w:start w:val="1"/>
+      <w:numFmt w:val="bullet"/>
+      <w:lvlText w:val=""/>
+      <w:lvlJc w:val="left"/>
+      <w:pPr>
+        <w:tabs>
+          <w:tab w:val="num" w:pos="5760"/>
+        </w:tabs>
+        <w:ind w:left="5760" w:hanging="360"/>
+      </w:pPr>
+      <w:rPr>
+        <w:rFonts w:ascii="Wingdings" w:hAnsi="Wingdings" w:hint="default"/>
+        <w:sz w:val="20"/>
+      </w:rPr>
+    </w:lvl>
+    <w:lvl w:ilvl="8" w:tentative="1">
+      <w:start w:val="1"/>
+      <w:numFmt w:val="bullet"/>
+      <w:lvlText w:val=""/>
+      <w:lvlJc w:val="left"/>
+      <w:pPr>
+        <w:tabs>
+          <w:tab w:val="num" w:pos="6480"/>
+        </w:tabs>
+        <w:ind w:left="6480" w:hanging="360"/>
+      </w:pPr>
+      <w:rPr>
+        <w:rFonts w:ascii="Wingdings" w:hAnsi="Wingdings" w:hint="default"/>
+        <w:sz w:val="20"/>
+      </w:rPr>
+    </w:lvl>
+  </w:abstractNum>
+  <w:abstractNum w:abstractNumId="3" w15:restartNumberingAfterBreak="0">
     <w:nsid w:val="32774227"/>
     <w:multiLevelType w:val="multilevel"/>
     <w:tmpl w:val="02502EE0"/>
@@ -553,8 +1840,625 @@
       </w:rPr>
     </w:lvl>
   </w:abstractNum>
+  <w:abstractNum w:abstractNumId="4" w15:restartNumberingAfterBreak="0">
+    <w:nsid w:val="3DF22695"/>
+    <w:multiLevelType w:val="multilevel"/>
+    <w:tmpl w:val="A09A9C02"/>
+    <w:lvl w:ilvl="0">
+      <w:start w:val="1"/>
+      <w:numFmt w:val="bullet"/>
+      <w:lvlText w:val=""/>
+      <w:lvlJc w:val="left"/>
+      <w:pPr>
+        <w:tabs>
+          <w:tab w:val="num" w:pos="720"/>
+        </w:tabs>
+        <w:ind w:left="720" w:hanging="360"/>
+      </w:pPr>
+      <w:rPr>
+        <w:rFonts w:ascii="Symbol" w:hAnsi="Symbol" w:hint="default"/>
+        <w:sz w:val="20"/>
+      </w:rPr>
+    </w:lvl>
+    <w:lvl w:ilvl="1" w:tentative="1">
+      <w:start w:val="1"/>
+      <w:numFmt w:val="bullet"/>
+      <w:lvlText w:val="o"/>
+      <w:lvlJc w:val="left"/>
+      <w:pPr>
+        <w:tabs>
+          <w:tab w:val="num" w:pos="1440"/>
+        </w:tabs>
+        <w:ind w:left="1440" w:hanging="360"/>
+      </w:pPr>
+      <w:rPr>
+        <w:rFonts w:ascii="Courier New" w:hAnsi="Courier New" w:hint="default"/>
+        <w:sz w:val="20"/>
+      </w:rPr>
+    </w:lvl>
+    <w:lvl w:ilvl="2" w:tentative="1">
+      <w:start w:val="1"/>
+      <w:numFmt w:val="bullet"/>
+      <w:lvlText w:val=""/>
+      <w:lvlJc w:val="left"/>
+      <w:pPr>
+        <w:tabs>
+          <w:tab w:val="num" w:pos="2160"/>
+        </w:tabs>
+        <w:ind w:left="2160" w:hanging="360"/>
+      </w:pPr>
+      <w:rPr>
+        <w:rFonts w:ascii="Wingdings" w:hAnsi="Wingdings" w:hint="default"/>
+        <w:sz w:val="20"/>
+      </w:rPr>
+    </w:lvl>
+    <w:lvl w:ilvl="3" w:tentative="1">
+      <w:start w:val="1"/>
+      <w:numFmt w:val="bullet"/>
+      <w:lvlText w:val=""/>
+      <w:lvlJc w:val="left"/>
+      <w:pPr>
+        <w:tabs>
+          <w:tab w:val="num" w:pos="2880"/>
+        </w:tabs>
+        <w:ind w:left="2880" w:hanging="360"/>
+      </w:pPr>
+      <w:rPr>
+        <w:rFonts w:ascii="Wingdings" w:hAnsi="Wingdings" w:hint="default"/>
+        <w:sz w:val="20"/>
+      </w:rPr>
+    </w:lvl>
+    <w:lvl w:ilvl="4" w:tentative="1">
+      <w:start w:val="1"/>
+      <w:numFmt w:val="bullet"/>
+      <w:lvlText w:val=""/>
+      <w:lvlJc w:val="left"/>
+      <w:pPr>
+        <w:tabs>
+          <w:tab w:val="num" w:pos="3600"/>
+        </w:tabs>
+        <w:ind w:left="3600" w:hanging="360"/>
+      </w:pPr>
+      <w:rPr>
+        <w:rFonts w:ascii="Wingdings" w:hAnsi="Wingdings" w:hint="default"/>
+        <w:sz w:val="20"/>
+      </w:rPr>
+    </w:lvl>
+    <w:lvl w:ilvl="5" w:tentative="1">
+      <w:start w:val="1"/>
+      <w:numFmt w:val="bullet"/>
+      <w:lvlText w:val=""/>
+      <w:lvlJc w:val="left"/>
+      <w:pPr>
+        <w:tabs>
+          <w:tab w:val="num" w:pos="4320"/>
+        </w:tabs>
+        <w:ind w:left="4320" w:hanging="360"/>
+      </w:pPr>
+      <w:rPr>
+        <w:rFonts w:ascii="Wingdings" w:hAnsi="Wingdings" w:hint="default"/>
+        <w:sz w:val="20"/>
+      </w:rPr>
+    </w:lvl>
+    <w:lvl w:ilvl="6" w:tentative="1">
+      <w:start w:val="1"/>
+      <w:numFmt w:val="bullet"/>
+      <w:lvlText w:val=""/>
+      <w:lvlJc w:val="left"/>
+      <w:pPr>
+        <w:tabs>
+          <w:tab w:val="num" w:pos="5040"/>
+        </w:tabs>
+        <w:ind w:left="5040" w:hanging="360"/>
+      </w:pPr>
+      <w:rPr>
+        <w:rFonts w:ascii="Wingdings" w:hAnsi="Wingdings" w:hint="default"/>
+        <w:sz w:val="20"/>
+      </w:rPr>
+    </w:lvl>
+    <w:lvl w:ilvl="7" w:tentative="1">
+      <w:start w:val="1"/>
+      <w:numFmt w:val="bullet"/>
+      <w:lvlText w:val=""/>
+      <w:lvlJc w:val="left"/>
+      <w:pPr>
+        <w:tabs>
+          <w:tab w:val="num" w:pos="5760"/>
+        </w:tabs>
+        <w:ind w:left="5760" w:hanging="360"/>
+      </w:pPr>
+      <w:rPr>
+        <w:rFonts w:ascii="Wingdings" w:hAnsi="Wingdings" w:hint="default"/>
+        <w:sz w:val="20"/>
+      </w:rPr>
+    </w:lvl>
+    <w:lvl w:ilvl="8" w:tentative="1">
+      <w:start w:val="1"/>
+      <w:numFmt w:val="bullet"/>
+      <w:lvlText w:val=""/>
+      <w:lvlJc w:val="left"/>
+      <w:pPr>
+        <w:tabs>
+          <w:tab w:val="num" w:pos="6480"/>
+        </w:tabs>
+        <w:ind w:left="6480" w:hanging="360"/>
+      </w:pPr>
+      <w:rPr>
+        <w:rFonts w:ascii="Wingdings" w:hAnsi="Wingdings" w:hint="default"/>
+        <w:sz w:val="20"/>
+      </w:rPr>
+    </w:lvl>
+  </w:abstractNum>
+  <w:abstractNum w:abstractNumId="5" w15:restartNumberingAfterBreak="0">
+    <w:nsid w:val="480226CA"/>
+    <w:multiLevelType w:val="multilevel"/>
+    <w:tmpl w:val="7B84E384"/>
+    <w:lvl w:ilvl="0">
+      <w:start w:val="1"/>
+      <w:numFmt w:val="bullet"/>
+      <w:lvlText w:val=""/>
+      <w:lvlJc w:val="left"/>
+      <w:pPr>
+        <w:tabs>
+          <w:tab w:val="num" w:pos="720"/>
+        </w:tabs>
+        <w:ind w:left="720" w:hanging="360"/>
+      </w:pPr>
+      <w:rPr>
+        <w:rFonts w:ascii="Symbol" w:hAnsi="Symbol" w:hint="default"/>
+        <w:sz w:val="20"/>
+      </w:rPr>
+    </w:lvl>
+    <w:lvl w:ilvl="1" w:tentative="1">
+      <w:start w:val="1"/>
+      <w:numFmt w:val="bullet"/>
+      <w:lvlText w:val="o"/>
+      <w:lvlJc w:val="left"/>
+      <w:pPr>
+        <w:tabs>
+          <w:tab w:val="num" w:pos="1440"/>
+        </w:tabs>
+        <w:ind w:left="1440" w:hanging="360"/>
+      </w:pPr>
+      <w:rPr>
+        <w:rFonts w:ascii="Courier New" w:hAnsi="Courier New" w:hint="default"/>
+        <w:sz w:val="20"/>
+      </w:rPr>
+    </w:lvl>
+    <w:lvl w:ilvl="2" w:tentative="1">
+      <w:start w:val="1"/>
+      <w:numFmt w:val="bullet"/>
+      <w:lvlText w:val=""/>
+      <w:lvlJc w:val="left"/>
+      <w:pPr>
+        <w:tabs>
+          <w:tab w:val="num" w:pos="2160"/>
+        </w:tabs>
+        <w:ind w:left="2160" w:hanging="360"/>
+      </w:pPr>
+      <w:rPr>
+        <w:rFonts w:ascii="Wingdings" w:hAnsi="Wingdings" w:hint="default"/>
+        <w:sz w:val="20"/>
+      </w:rPr>
+    </w:lvl>
+    <w:lvl w:ilvl="3" w:tentative="1">
+      <w:start w:val="1"/>
+      <w:numFmt w:val="bullet"/>
+      <w:lvlText w:val=""/>
+      <w:lvlJc w:val="left"/>
+      <w:pPr>
+        <w:tabs>
+          <w:tab w:val="num" w:pos="2880"/>
+        </w:tabs>
+        <w:ind w:left="2880" w:hanging="360"/>
+      </w:pPr>
+      <w:rPr>
+        <w:rFonts w:ascii="Wingdings" w:hAnsi="Wingdings" w:hint="default"/>
+        <w:sz w:val="20"/>
+      </w:rPr>
+    </w:lvl>
+    <w:lvl w:ilvl="4" w:tentative="1">
+      <w:start w:val="1"/>
+      <w:numFmt w:val="bullet"/>
+      <w:lvlText w:val=""/>
+      <w:lvlJc w:val="left"/>
+      <w:pPr>
+        <w:tabs>
+          <w:tab w:val="num" w:pos="3600"/>
+        </w:tabs>
+        <w:ind w:left="3600" w:hanging="360"/>
+      </w:pPr>
+      <w:rPr>
+        <w:rFonts w:ascii="Wingdings" w:hAnsi="Wingdings" w:hint="default"/>
+        <w:sz w:val="20"/>
+      </w:rPr>
+    </w:lvl>
+    <w:lvl w:ilvl="5" w:tentative="1">
+      <w:start w:val="1"/>
+      <w:numFmt w:val="bullet"/>
+      <w:lvlText w:val=""/>
+      <w:lvlJc w:val="left"/>
+      <w:pPr>
+        <w:tabs>
+          <w:tab w:val="num" w:pos="4320"/>
+        </w:tabs>
+        <w:ind w:left="4320" w:hanging="360"/>
+      </w:pPr>
+      <w:rPr>
+        <w:rFonts w:ascii="Wingdings" w:hAnsi="Wingdings" w:hint="default"/>
+        <w:sz w:val="20"/>
+      </w:rPr>
+    </w:lvl>
+    <w:lvl w:ilvl="6" w:tentative="1">
+      <w:start w:val="1"/>
+      <w:numFmt w:val="bullet"/>
+      <w:lvlText w:val=""/>
+      <w:lvlJc w:val="left"/>
+      <w:pPr>
+        <w:tabs>
+          <w:tab w:val="num" w:pos="5040"/>
+        </w:tabs>
+        <w:ind w:left="5040" w:hanging="360"/>
+      </w:pPr>
+      <w:rPr>
+        <w:rFonts w:ascii="Wingdings" w:hAnsi="Wingdings" w:hint="default"/>
+        <w:sz w:val="20"/>
+      </w:rPr>
+    </w:lvl>
+    <w:lvl w:ilvl="7" w:tentative="1">
+      <w:start w:val="1"/>
+      <w:numFmt w:val="bullet"/>
+      <w:lvlText w:val=""/>
+      <w:lvlJc w:val="left"/>
+      <w:pPr>
+        <w:tabs>
+          <w:tab w:val="num" w:pos="5760"/>
+        </w:tabs>
+        <w:ind w:left="5760" w:hanging="360"/>
+      </w:pPr>
+      <w:rPr>
+        <w:rFonts w:ascii="Wingdings" w:hAnsi="Wingdings" w:hint="default"/>
+        <w:sz w:val="20"/>
+      </w:rPr>
+    </w:lvl>
+    <w:lvl w:ilvl="8" w:tentative="1">
+      <w:start w:val="1"/>
+      <w:numFmt w:val="bullet"/>
+      <w:lvlText w:val=""/>
+      <w:lvlJc w:val="left"/>
+      <w:pPr>
+        <w:tabs>
+          <w:tab w:val="num" w:pos="6480"/>
+        </w:tabs>
+        <w:ind w:left="6480" w:hanging="360"/>
+      </w:pPr>
+      <w:rPr>
+        <w:rFonts w:ascii="Wingdings" w:hAnsi="Wingdings" w:hint="default"/>
+        <w:sz w:val="20"/>
+      </w:rPr>
+    </w:lvl>
+  </w:abstractNum>
+  <w:abstractNum w:abstractNumId="6" w15:restartNumberingAfterBreak="0">
+    <w:nsid w:val="54B151E2"/>
+    <w:multiLevelType w:val="multilevel"/>
+    <w:tmpl w:val="3E9EC526"/>
+    <w:lvl w:ilvl="0">
+      <w:start w:val="1"/>
+      <w:numFmt w:val="bullet"/>
+      <w:lvlText w:val=""/>
+      <w:lvlJc w:val="left"/>
+      <w:pPr>
+        <w:tabs>
+          <w:tab w:val="num" w:pos="720"/>
+        </w:tabs>
+        <w:ind w:left="720" w:hanging="360"/>
+      </w:pPr>
+      <w:rPr>
+        <w:rFonts w:ascii="Symbol" w:hAnsi="Symbol" w:hint="default"/>
+        <w:sz w:val="20"/>
+      </w:rPr>
+    </w:lvl>
+    <w:lvl w:ilvl="1" w:tentative="1">
+      <w:start w:val="1"/>
+      <w:numFmt w:val="bullet"/>
+      <w:lvlText w:val="o"/>
+      <w:lvlJc w:val="left"/>
+      <w:pPr>
+        <w:tabs>
+          <w:tab w:val="num" w:pos="1440"/>
+        </w:tabs>
+        <w:ind w:left="1440" w:hanging="360"/>
+      </w:pPr>
+      <w:rPr>
+        <w:rFonts w:ascii="Courier New" w:hAnsi="Courier New" w:hint="default"/>
+        <w:sz w:val="20"/>
+      </w:rPr>
+    </w:lvl>
+    <w:lvl w:ilvl="2" w:tentative="1">
+      <w:start w:val="1"/>
+      <w:numFmt w:val="bullet"/>
+      <w:lvlText w:val=""/>
+      <w:lvlJc w:val="left"/>
+      <w:pPr>
+        <w:tabs>
+          <w:tab w:val="num" w:pos="2160"/>
+        </w:tabs>
+        <w:ind w:left="2160" w:hanging="360"/>
+      </w:pPr>
+      <w:rPr>
+        <w:rFonts w:ascii="Wingdings" w:hAnsi="Wingdings" w:hint="default"/>
+        <w:sz w:val="20"/>
+      </w:rPr>
+    </w:lvl>
+    <w:lvl w:ilvl="3" w:tentative="1">
+      <w:start w:val="1"/>
+      <w:numFmt w:val="bullet"/>
+      <w:lvlText w:val=""/>
+      <w:lvlJc w:val="left"/>
+      <w:pPr>
+        <w:tabs>
+          <w:tab w:val="num" w:pos="2880"/>
+        </w:tabs>
+        <w:ind w:left="2880" w:hanging="360"/>
+      </w:pPr>
+      <w:rPr>
+        <w:rFonts w:ascii="Wingdings" w:hAnsi="Wingdings" w:hint="default"/>
+        <w:sz w:val="20"/>
+      </w:rPr>
+    </w:lvl>
+    <w:lvl w:ilvl="4" w:tentative="1">
+      <w:start w:val="1"/>
+      <w:numFmt w:val="bullet"/>
+      <w:lvlText w:val=""/>
+      <w:lvlJc w:val="left"/>
+      <w:pPr>
+        <w:tabs>
+          <w:tab w:val="num" w:pos="3600"/>
+        </w:tabs>
+        <w:ind w:left="3600" w:hanging="360"/>
+      </w:pPr>
+      <w:rPr>
+        <w:rFonts w:ascii="Wingdings" w:hAnsi="Wingdings" w:hint="default"/>
+        <w:sz w:val="20"/>
+      </w:rPr>
+    </w:lvl>
+    <w:lvl w:ilvl="5" w:tentative="1">
+      <w:start w:val="1"/>
+      <w:numFmt w:val="bullet"/>
+      <w:lvlText w:val=""/>
+      <w:lvlJc w:val="left"/>
+      <w:pPr>
+        <w:tabs>
+          <w:tab w:val="num" w:pos="4320"/>
+        </w:tabs>
+        <w:ind w:left="4320" w:hanging="360"/>
+      </w:pPr>
+      <w:rPr>
+        <w:rFonts w:ascii="Wingdings" w:hAnsi="Wingdings" w:hint="default"/>
+        <w:sz w:val="20"/>
+      </w:rPr>
+    </w:lvl>
+    <w:lvl w:ilvl="6" w:tentative="1">
+      <w:start w:val="1"/>
+      <w:numFmt w:val="bullet"/>
+      <w:lvlText w:val=""/>
+      <w:lvlJc w:val="left"/>
+      <w:pPr>
+        <w:tabs>
+          <w:tab w:val="num" w:pos="5040"/>
+        </w:tabs>
+        <w:ind w:left="5040" w:hanging="360"/>
+      </w:pPr>
+      <w:rPr>
+        <w:rFonts w:ascii="Wingdings" w:hAnsi="Wingdings" w:hint="default"/>
+        <w:sz w:val="20"/>
+      </w:rPr>
+    </w:lvl>
+    <w:lvl w:ilvl="7" w:tentative="1">
+      <w:start w:val="1"/>
+      <w:numFmt w:val="bullet"/>
+      <w:lvlText w:val=""/>
+      <w:lvlJc w:val="left"/>
+      <w:pPr>
+        <w:tabs>
+          <w:tab w:val="num" w:pos="5760"/>
+        </w:tabs>
+        <w:ind w:left="5760" w:hanging="360"/>
+      </w:pPr>
+      <w:rPr>
+        <w:rFonts w:ascii="Wingdings" w:hAnsi="Wingdings" w:hint="default"/>
+        <w:sz w:val="20"/>
+      </w:rPr>
+    </w:lvl>
+    <w:lvl w:ilvl="8" w:tentative="1">
+      <w:start w:val="1"/>
+      <w:numFmt w:val="bullet"/>
+      <w:lvlText w:val=""/>
+      <w:lvlJc w:val="left"/>
+      <w:pPr>
+        <w:tabs>
+          <w:tab w:val="num" w:pos="6480"/>
+        </w:tabs>
+        <w:ind w:left="6480" w:hanging="360"/>
+      </w:pPr>
+      <w:rPr>
+        <w:rFonts w:ascii="Wingdings" w:hAnsi="Wingdings" w:hint="default"/>
+        <w:sz w:val="20"/>
+      </w:rPr>
+    </w:lvl>
+  </w:abstractNum>
+  <w:abstractNum w:abstractNumId="7" w15:restartNumberingAfterBreak="0">
+    <w:nsid w:val="5EBD3852"/>
+    <w:multiLevelType w:val="multilevel"/>
+    <w:tmpl w:val="ABF0824E"/>
+    <w:lvl w:ilvl="0">
+      <w:start w:val="1"/>
+      <w:numFmt w:val="bullet"/>
+      <w:lvlText w:val=""/>
+      <w:lvlJc w:val="left"/>
+      <w:pPr>
+        <w:tabs>
+          <w:tab w:val="num" w:pos="720"/>
+        </w:tabs>
+        <w:ind w:left="720" w:hanging="360"/>
+      </w:pPr>
+      <w:rPr>
+        <w:rFonts w:ascii="Symbol" w:hAnsi="Symbol" w:hint="default"/>
+        <w:sz w:val="20"/>
+      </w:rPr>
+    </w:lvl>
+    <w:lvl w:ilvl="1" w:tentative="1">
+      <w:start w:val="1"/>
+      <w:numFmt w:val="bullet"/>
+      <w:lvlText w:val="o"/>
+      <w:lvlJc w:val="left"/>
+      <w:pPr>
+        <w:tabs>
+          <w:tab w:val="num" w:pos="1440"/>
+        </w:tabs>
+        <w:ind w:left="1440" w:hanging="360"/>
+      </w:pPr>
+      <w:rPr>
+        <w:rFonts w:ascii="Courier New" w:hAnsi="Courier New" w:hint="default"/>
+        <w:sz w:val="20"/>
+      </w:rPr>
+    </w:lvl>
+    <w:lvl w:ilvl="2" w:tentative="1">
+      <w:start w:val="1"/>
+      <w:numFmt w:val="bullet"/>
+      <w:lvlText w:val=""/>
+      <w:lvlJc w:val="left"/>
+      <w:pPr>
+        <w:tabs>
+          <w:tab w:val="num" w:pos="2160"/>
+        </w:tabs>
+        <w:ind w:left="2160" w:hanging="360"/>
+      </w:pPr>
+      <w:rPr>
+        <w:rFonts w:ascii="Wingdings" w:hAnsi="Wingdings" w:hint="default"/>
+        <w:sz w:val="20"/>
+      </w:rPr>
+    </w:lvl>
+    <w:lvl w:ilvl="3" w:tentative="1">
+      <w:start w:val="1"/>
+      <w:numFmt w:val="bullet"/>
+      <w:lvlText w:val=""/>
+      <w:lvlJc w:val="left"/>
+      <w:pPr>
+        <w:tabs>
+          <w:tab w:val="num" w:pos="2880"/>
+        </w:tabs>
+        <w:ind w:left="2880" w:hanging="360"/>
+      </w:pPr>
+      <w:rPr>
+        <w:rFonts w:ascii="Wingdings" w:hAnsi="Wingdings" w:hint="default"/>
+        <w:sz w:val="20"/>
+      </w:rPr>
+    </w:lvl>
+    <w:lvl w:ilvl="4" w:tentative="1">
+      <w:start w:val="1"/>
+      <w:numFmt w:val="bullet"/>
+      <w:lvlText w:val=""/>
+      <w:lvlJc w:val="left"/>
+      <w:pPr>
+        <w:tabs>
+          <w:tab w:val="num" w:pos="3600"/>
+        </w:tabs>
+        <w:ind w:left="3600" w:hanging="360"/>
+      </w:pPr>
+      <w:rPr>
+        <w:rFonts w:ascii="Wingdings" w:hAnsi="Wingdings" w:hint="default"/>
+        <w:sz w:val="20"/>
+      </w:rPr>
+    </w:lvl>
+    <w:lvl w:ilvl="5" w:tentative="1">
+      <w:start w:val="1"/>
+      <w:numFmt w:val="bullet"/>
+      <w:lvlText w:val=""/>
+      <w:lvlJc w:val="left"/>
+      <w:pPr>
+        <w:tabs>
+          <w:tab w:val="num" w:pos="4320"/>
+        </w:tabs>
+        <w:ind w:left="4320" w:hanging="360"/>
+      </w:pPr>
+      <w:rPr>
+        <w:rFonts w:ascii="Wingdings" w:hAnsi="Wingdings" w:hint="default"/>
+        <w:sz w:val="20"/>
+      </w:rPr>
+    </w:lvl>
+    <w:lvl w:ilvl="6" w:tentative="1">
+      <w:start w:val="1"/>
+      <w:numFmt w:val="bullet"/>
+      <w:lvlText w:val=""/>
+      <w:lvlJc w:val="left"/>
+      <w:pPr>
+        <w:tabs>
+          <w:tab w:val="num" w:pos="5040"/>
+        </w:tabs>
+        <w:ind w:left="5040" w:hanging="360"/>
+      </w:pPr>
+      <w:rPr>
+        <w:rFonts w:ascii="Wingdings" w:hAnsi="Wingdings" w:hint="default"/>
+        <w:sz w:val="20"/>
+      </w:rPr>
+    </w:lvl>
+    <w:lvl w:ilvl="7" w:tentative="1">
+      <w:start w:val="1"/>
+      <w:numFmt w:val="bullet"/>
+      <w:lvlText w:val=""/>
+      <w:lvlJc w:val="left"/>
+      <w:pPr>
+        <w:tabs>
+          <w:tab w:val="num" w:pos="5760"/>
+        </w:tabs>
+        <w:ind w:left="5760" w:hanging="360"/>
+      </w:pPr>
+      <w:rPr>
+        <w:rFonts w:ascii="Wingdings" w:hAnsi="Wingdings" w:hint="default"/>
+        <w:sz w:val="20"/>
+      </w:rPr>
+    </w:lvl>
+    <w:lvl w:ilvl="8" w:tentative="1">
+      <w:start w:val="1"/>
+      <w:numFmt w:val="bullet"/>
+      <w:lvlText w:val=""/>
+      <w:lvlJc w:val="left"/>
+      <w:pPr>
+        <w:tabs>
+          <w:tab w:val="num" w:pos="6480"/>
+        </w:tabs>
+        <w:ind w:left="6480" w:hanging="360"/>
+      </w:pPr>
+      <w:rPr>
+        <w:rFonts w:ascii="Wingdings" w:hAnsi="Wingdings" w:hint="default"/>
+        <w:sz w:val="20"/>
+      </w:rPr>
+    </w:lvl>
+  </w:abstractNum>
   <w:num w:numId="1" w16cid:durableId="1795518342">
+    <w:abstractNumId w:val="3"/>
+  </w:num>
+  <w:num w:numId="2" w16cid:durableId="1662809117">
+    <w:abstractNumId w:val="5"/>
+  </w:num>
+  <w:num w:numId="3" w16cid:durableId="1601529175">
+    <w:abstractNumId w:val="6"/>
+  </w:num>
+  <w:num w:numId="4" w16cid:durableId="1220357701">
+    <w:abstractNumId w:val="2"/>
+  </w:num>
+  <w:num w:numId="5" w16cid:durableId="789784053">
+    <w:abstractNumId w:val="4"/>
+  </w:num>
+  <w:num w:numId="6" w16cid:durableId="254635689">
+    <w:abstractNumId w:val="1"/>
+  </w:num>
+  <w:num w:numId="7" w16cid:durableId="219249230">
     <w:abstractNumId w:val="0"/>
+  </w:num>
+  <w:num w:numId="8" w16cid:durableId="880164660">
+    <w:abstractNumId w:val="7"/>
   </w:num>
 </w:numbering>
 </file>
@@ -987,7 +2891,6 @@
     <w:next w:val="Normal"/>
     <w:link w:val="Ttulo2Car"/>
     <w:uiPriority w:val="9"/>
-    <w:semiHidden/>
     <w:unhideWhenUsed/>
     <w:qFormat/>
     <w:rsid w:val="002B1356"/>
@@ -1203,7 +3106,6 @@
     <w:basedOn w:val="Fuentedeprrafopredeter"/>
     <w:link w:val="Ttulo2"/>
     <w:uiPriority w:val="9"/>
-    <w:semiHidden/>
     <w:rsid w:val="002B1356"/>
     <w:rPr>
       <w:rFonts w:asciiTheme="majorHAnsi" w:eastAsiaTheme="majorEastAsia" w:hAnsiTheme="majorHAnsi" w:cstheme="majorBidi"/>

</xml_diff>